<commit_message>
[khmer_angkor] correct last updated in kak_documentation_kh files
fixes #3812:
</commit_message>
<xml_diff>
--- a/release/k/khmer_angkor/extras/KAK_Documentation_KH.docx
+++ b/release/k/khmer_angkor/extras/KAK_Documentation_KH.docx
@@ -1,6 +1,6 @@
 
 <file path=word/document.xml><?xml version="1.0" encoding="utf-8"?>
-<w:document xmlns:wpc="http://schemas.microsoft.com/office/word/2010/wordprocessingCanvas" xmlns:cx="http://schemas.microsoft.com/office/drawing/2014/chartex" xmlns:cx1="http://schemas.microsoft.com/office/drawing/2015/9/8/chartex" xmlns:cx2="http://schemas.microsoft.com/office/drawing/2015/10/21/chartex" xmlns:cx3="http://schemas.microsoft.com/office/drawing/2016/5/9/chartex" xmlns:cx4="http://schemas.microsoft.com/office/drawing/2016/5/10/chartex" xmlns:cx5="http://schemas.microsoft.com/office/drawing/2016/5/11/chartex" xmlns:cx6="http://schemas.microsoft.com/office/drawing/2016/5/12/chartex" xmlns:cx7="http://schemas.microsoft.com/office/drawing/2016/5/13/chartex" xmlns:cx8="http://schemas.microsoft.com/office/drawing/2016/5/14/chartex" xmlns:mc="http://schemas.openxmlformats.org/markup-compatibility/2006" xmlns:aink="http://schemas.microsoft.com/office/drawing/2016/ink" xmlns:am3d="http://schemas.microsoft.com/office/drawing/2017/model3d" xmlns:o="urn:schemas-microsoft-com:office:office" xmlns:oel="http://schemas.microsoft.com/office/2019/extlst" xmlns:r="http://schemas.openxmlformats.org/officeDocument/2006/relationships" xmlns:m="http://schemas.openxmlformats.org/officeDocument/2006/math" xmlns:v="urn:schemas-microsoft-com:vml" xmlns:wp14="http://schemas.microsoft.com/office/word/2010/wordprocessingDrawing" xmlns:wp="http://schemas.openxmlformats.org/drawingml/2006/wordprocessingDrawing" xmlns:w10="urn:schemas-microsoft-com:office:word" xmlns:w="http://schemas.openxmlformats.org/wordprocessingml/2006/main" xmlns:w14="http://schemas.microsoft.com/office/word/2010/wordml" xmlns:w15="http://schemas.microsoft.com/office/word/2012/wordml" xmlns:w16cex="http://schemas.microsoft.com/office/word/2018/wordml/cex" xmlns:w16cid="http://schemas.microsoft.com/office/word/2016/wordml/cid" xmlns:w16="http://schemas.microsoft.com/office/word/2018/wordml" xmlns:w16du="http://schemas.microsoft.com/office/word/2023/wordml/word16du" xmlns:w16sdtdh="http://schemas.microsoft.com/office/word/2020/wordml/sdtdatahash" xmlns:w16se="http://schemas.microsoft.com/office/word/2015/wordml/symex" xmlns:wpg="http://schemas.microsoft.com/office/word/2010/wordprocessingGroup" xmlns:wpi="http://schemas.microsoft.com/office/word/2010/wordprocessingInk" xmlns:wne="http://schemas.microsoft.com/office/word/2006/wordml" xmlns:wps="http://schemas.microsoft.com/office/word/2010/wordprocessingShape" mc:Ignorable="w14 w15 w16se w16cid w16 w16cex w16sdtdh w16du wp14">
+<w:document xmlns:wpc="http://schemas.microsoft.com/office/word/2010/wordprocessingCanvas" xmlns:cx="http://schemas.microsoft.com/office/drawing/2014/chartex" xmlns:cx1="http://schemas.microsoft.com/office/drawing/2015/9/8/chartex" xmlns:cx2="http://schemas.microsoft.com/office/drawing/2015/10/21/chartex" xmlns:cx3="http://schemas.microsoft.com/office/drawing/2016/5/9/chartex" xmlns:cx4="http://schemas.microsoft.com/office/drawing/2016/5/10/chartex" xmlns:cx5="http://schemas.microsoft.com/office/drawing/2016/5/11/chartex" xmlns:cx6="http://schemas.microsoft.com/office/drawing/2016/5/12/chartex" xmlns:cx7="http://schemas.microsoft.com/office/drawing/2016/5/13/chartex" xmlns:cx8="http://schemas.microsoft.com/office/drawing/2016/5/14/chartex" xmlns:mc="http://schemas.openxmlformats.org/markup-compatibility/2006" xmlns:aink="http://schemas.microsoft.com/office/drawing/2016/ink" xmlns:am3d="http://schemas.microsoft.com/office/drawing/2017/model3d" xmlns:o="urn:schemas-microsoft-com:office:office" xmlns:oel="http://schemas.microsoft.com/office/2019/extlst" xmlns:r="http://schemas.openxmlformats.org/officeDocument/2006/relationships" xmlns:m="http://schemas.openxmlformats.org/officeDocument/2006/math" xmlns:v="urn:schemas-microsoft-com:vml" xmlns:wp14="http://schemas.microsoft.com/office/word/2010/wordprocessingDrawing" xmlns:wp="http://schemas.openxmlformats.org/drawingml/2006/wordprocessingDrawing" xmlns:w10="urn:schemas-microsoft-com:office:word" xmlns:w="http://schemas.openxmlformats.org/wordprocessingml/2006/main" xmlns:w14="http://schemas.microsoft.com/office/word/2010/wordml" xmlns:w15="http://schemas.microsoft.com/office/word/2012/wordml" xmlns:w16cex="http://schemas.microsoft.com/office/word/2018/wordml/cex" xmlns:w16cid="http://schemas.microsoft.com/office/word/2016/wordml/cid" xmlns:w16="http://schemas.microsoft.com/office/word/2018/wordml" xmlns:w16du="http://schemas.microsoft.com/office/word/2023/wordml/word16du" xmlns:w16sdtdh="http://schemas.microsoft.com/office/word/2020/wordml/sdtdatahash" xmlns:w16sdtfl="http://schemas.microsoft.com/office/word/2024/wordml/sdtformatlock" xmlns:w16se="http://schemas.microsoft.com/office/word/2015/wordml/symex" xmlns:wpg="http://schemas.microsoft.com/office/word/2010/wordprocessingGroup" xmlns:wpi="http://schemas.microsoft.com/office/word/2010/wordprocessingInk" xmlns:wne="http://schemas.microsoft.com/office/word/2006/wordml" xmlns:wps="http://schemas.microsoft.com/office/word/2010/wordprocessingShape" mc:Ignorable="w14 w15 w16se w16cid w16 w16cex w16sdtdh w16sdtfl w16du wp14">
   <w:body>
     <w:p>
       <w:pPr>
@@ -2428,17 +2428,7 @@
                 <w:sz w:val="32"/>
                 <w:szCs w:val="32"/>
               </w:rPr>
-              <w:t>1</w:t>
-            </w:r>
-            <w:r>
-              <w:rPr>
-                <w:rFonts w:ascii="Limon S1" w:hAnsi="Limon S1"/>
-                <w:noProof/>
-                <w:webHidden/>
-                <w:sz w:val="32"/>
-                <w:szCs w:val="32"/>
-              </w:rPr>
-              <w:t>2</w:t>
+              <w:t>12</w:t>
             </w:r>
             <w:r>
               <w:rPr>
@@ -3432,7 +3422,9 @@
     </w:p>
     <w:p>
       <w:pPr>
-        <w:rPr>
+        <w:jc w:val="both"/>
+        <w:rPr>
+          <w:spacing w:val="2"/>
           <w:sz w:val="20"/>
           <w:cs/>
           <w:lang w:val="en-US"/>
@@ -3441,6 +3433,7 @@
       <w:r>
         <w:rPr>
           <w:rFonts w:ascii="Khmer Mondulkiri" w:hAnsi="Khmer Mondulkiri" w:hint="cs"/>
+          <w:spacing w:val="2"/>
           <w:sz w:val="20"/>
           <w:cs/>
           <w:lang w:val="en-US"/>
@@ -3450,6 +3443,7 @@
       <w:r>
         <w:rPr>
           <w:rFonts w:ascii="Khmer Mondulkiri" w:hAnsi="Khmer Mondulkiri" w:hint="cs"/>
+          <w:spacing w:val="2"/>
           <w:sz w:val="20"/>
           <w:cs/>
           <w:lang w:val="en-US"/>
@@ -3459,6 +3453,7 @@
       <w:r>
         <w:rPr>
           <w:rFonts w:ascii="Khmer Mondulkiri" w:hAnsi="Khmer Mondulkiri"/>
+          <w:spacing w:val="2"/>
           <w:sz w:val="20"/>
           <w:lang w:val="en-US"/>
         </w:rPr>
@@ -3467,6 +3462,7 @@
       <w:r>
         <w:rPr>
           <w:rFonts w:ascii="Khmer Mondulkiri" w:hAnsi="Khmer Mondulkiri" w:hint="cs"/>
+          <w:spacing w:val="2"/>
           <w:sz w:val="20"/>
           <w:cs/>
           <w:lang w:val="en-US"/>
@@ -3476,6 +3472,7 @@
       <w:r>
         <w:rPr>
           <w:rFonts w:ascii="Khmer Mondulkiri" w:hAnsi="Khmer Mondulkiri"/>
+          <w:spacing w:val="2"/>
           <w:sz w:val="20"/>
           <w:lang w:val="en-US"/>
         </w:rPr>
@@ -3484,6 +3481,7 @@
       <w:r>
         <w:rPr>
           <w:rFonts w:ascii="Khmer Mondulkiri" w:hAnsi="Khmer Mondulkiri" w:hint="cs"/>
+          <w:spacing w:val="2"/>
           <w:sz w:val="20"/>
           <w:cs/>
           <w:lang w:val="en-US"/>
@@ -3493,6 +3491,7 @@
       <w:r>
         <w:rPr>
           <w:rFonts w:ascii="Khmer Mondulkiri" w:hAnsi="Khmer Mondulkiri"/>
+          <w:spacing w:val="2"/>
           <w:sz w:val="20"/>
           <w:lang w:val="en-US"/>
         </w:rPr>
@@ -3501,6 +3500,7 @@
       <w:r>
         <w:rPr>
           <w:rFonts w:ascii="Khmer Mondulkiri" w:hAnsi="Khmer Mondulkiri" w:hint="cs"/>
+          <w:spacing w:val="2"/>
           <w:sz w:val="20"/>
           <w:cs/>
           <w:lang w:val="en-US"/>
@@ -3510,6 +3510,7 @@
       <w:r>
         <w:rPr>
           <w:rFonts w:ascii="Khmer Mondulkiri" w:hAnsi="Khmer Mondulkiri" w:hint="cs"/>
+          <w:spacing w:val="2"/>
           <w:sz w:val="20"/>
           <w:lang w:val="en-US"/>
         </w:rPr>
@@ -3518,6 +3519,7 @@
       <w:r>
         <w:rPr>
           <w:rFonts w:ascii="Khmer Mondulkiri" w:hAnsi="Khmer Mondulkiri" w:hint="cs"/>
+          <w:spacing w:val="2"/>
           <w:sz w:val="20"/>
           <w:cs/>
           <w:lang w:val="en-US"/>
@@ -3527,6 +3529,7 @@
       <w:r>
         <w:rPr>
           <w:rFonts w:ascii="Khmer Mondulkiri" w:hAnsi="Khmer Mondulkiri" w:hint="cs"/>
+          <w:spacing w:val="2"/>
           <w:sz w:val="20"/>
           <w:lang w:val="en-US"/>
         </w:rPr>
@@ -3535,6 +3538,7 @@
       <w:r>
         <w:rPr>
           <w:rFonts w:ascii="Khmer Mondulkiri" w:hAnsi="Khmer Mondulkiri" w:hint="cs"/>
+          <w:spacing w:val="2"/>
           <w:sz w:val="20"/>
           <w:cs/>
           <w:lang w:val="en-US"/>
@@ -3544,6 +3548,7 @@
       <w:r>
         <w:rPr>
           <w:rFonts w:ascii="Khmer Mondulkiri" w:hAnsi="Khmer Mondulkiri" w:hint="cs"/>
+          <w:spacing w:val="2"/>
           <w:sz w:val="20"/>
           <w:cs/>
           <w:lang w:val="en-US"/>
@@ -3553,6 +3558,7 @@
       <w:r>
         <w:rPr>
           <w:rFonts w:ascii="Khmer Mondulkiri" w:hAnsi="Khmer Mondulkiri" w:hint="cs"/>
+          <w:spacing w:val="2"/>
           <w:sz w:val="20"/>
           <w:cs/>
           <w:lang w:val="en-US"/>
@@ -3562,6 +3568,7 @@
       <w:r>
         <w:rPr>
           <w:rFonts w:ascii="Khmer Mondulkiri" w:hAnsi="Khmer Mondulkiri" w:hint="cs"/>
+          <w:spacing w:val="2"/>
           <w:sz w:val="20"/>
           <w:lang w:val="en-US"/>
         </w:rPr>
@@ -3570,6 +3577,7 @@
       <w:r>
         <w:rPr>
           <w:rFonts w:ascii="Khmer Mondulkiri" w:hAnsi="Khmer Mondulkiri" w:hint="cs"/>
+          <w:spacing w:val="2"/>
           <w:sz w:val="20"/>
           <w:cs/>
           <w:lang w:val="en-US"/>
@@ -3579,6 +3587,7 @@
       <w:r>
         <w:rPr>
           <w:rFonts w:ascii="Khmer Mondulkiri" w:hAnsi="Khmer Mondulkiri" w:hint="cs"/>
+          <w:spacing w:val="2"/>
           <w:sz w:val="20"/>
           <w:cs/>
           <w:lang w:val="en-US"/>
@@ -3588,6 +3597,7 @@
       <w:r>
         <w:rPr>
           <w:rFonts w:ascii="Khmer Mondulkiri" w:hAnsi="Khmer Mondulkiri"/>
+          <w:spacing w:val="2"/>
           <w:sz w:val="20"/>
           <w:lang w:val="en-US"/>
         </w:rPr>
@@ -3596,6 +3606,7 @@
       <w:r>
         <w:rPr>
           <w:rFonts w:ascii="Khmer Mondulkiri" w:hAnsi="Khmer Mondulkiri" w:hint="cs"/>
+          <w:spacing w:val="2"/>
           <w:sz w:val="20"/>
           <w:lang w:val="en-US"/>
         </w:rPr>
@@ -3604,6 +3615,7 @@
       <w:r>
         <w:rPr>
           <w:rFonts w:ascii="Khmer Mondulkiri" w:hAnsi="Khmer Mondulkiri"/>
+          <w:spacing w:val="2"/>
           <w:sz w:val="20"/>
           <w:lang w:val="en-US"/>
         </w:rPr>
@@ -3612,6 +3624,7 @@
       <w:r>
         <w:rPr>
           <w:rFonts w:ascii="Khmer Mondulkiri" w:hAnsi="Khmer Mondulkiri" w:hint="cs"/>
+          <w:spacing w:val="2"/>
           <w:sz w:val="20"/>
           <w:cs/>
           <w:lang w:val="en-US"/>
@@ -3621,6 +3634,7 @@
       <w:r>
         <w:rPr>
           <w:rFonts w:ascii="Khmer Mondulkiri" w:hAnsi="Khmer Mondulkiri" w:hint="cs"/>
+          <w:spacing w:val="2"/>
           <w:sz w:val="20"/>
           <w:cs/>
           <w:lang w:val="en-US"/>
@@ -3630,6 +3644,7 @@
       <w:r>
         <w:rPr>
           <w:rFonts w:ascii="Khmer Mondulkiri" w:hAnsi="Khmer Mondulkiri" w:hint="cs"/>
+          <w:spacing w:val="2"/>
           <w:sz w:val="20"/>
           <w:cs/>
           <w:lang w:val="en-US"/>
@@ -3639,6 +3654,7 @@
       <w:r>
         <w:rPr>
           <w:rFonts w:ascii="Khmer Mondulkiri" w:hAnsi="Khmer Mondulkiri" w:hint="cs"/>
+          <w:spacing w:val="2"/>
           <w:sz w:val="20"/>
           <w:cs/>
           <w:lang w:val="en-US"/>
@@ -3648,6 +3664,7 @@
       <w:r>
         <w:rPr>
           <w:rFonts w:ascii="Khmer Mondulkiri" w:hAnsi="Khmer Mondulkiri" w:hint="cs"/>
+          <w:spacing w:val="2"/>
           <w:sz w:val="20"/>
           <w:cs/>
           <w:lang w:val="en-US"/>
@@ -3657,6 +3674,7 @@
       <w:r>
         <w:rPr>
           <w:rFonts w:ascii="Khmer Mondulkiri" w:hAnsi="Khmer Mondulkiri" w:hint="cs"/>
+          <w:spacing w:val="2"/>
           <w:sz w:val="20"/>
           <w:cs/>
           <w:lang w:val="en-US"/>
@@ -3666,6 +3684,7 @@
       <w:r>
         <w:rPr>
           <w:rFonts w:ascii="Khmer Mondulkiri" w:hAnsi="Khmer Mondulkiri" w:hint="cs"/>
+          <w:spacing w:val="2"/>
           <w:sz w:val="20"/>
           <w:lang w:val="en-US"/>
         </w:rPr>
@@ -3674,6 +3693,7 @@
       <w:r>
         <w:rPr>
           <w:rFonts w:ascii="Khmer Mondulkiri" w:hAnsi="Khmer Mondulkiri" w:hint="cs"/>
+          <w:spacing w:val="2"/>
           <w:sz w:val="20"/>
           <w:cs/>
           <w:lang w:val="en-US"/>
@@ -3683,6 +3703,7 @@
       <w:r>
         <w:rPr>
           <w:rFonts w:ascii="Khmer Mondulkiri" w:hAnsi="Khmer Mondulkiri"/>
+          <w:spacing w:val="2"/>
           <w:sz w:val="20"/>
           <w:lang w:val="en-US"/>
         </w:rPr>
@@ -3691,6 +3712,7 @@
       <w:r>
         <w:rPr>
           <w:rFonts w:ascii="Khmer Mondulkiri" w:hAnsi="Khmer Mondulkiri" w:hint="cs"/>
+          <w:spacing w:val="2"/>
           <w:sz w:val="20"/>
           <w:cs/>
           <w:lang w:val="en-US"/>
@@ -3700,6 +3722,7 @@
       <w:r>
         <w:rPr>
           <w:rFonts w:ascii="Khmer Mondulkiri" w:hAnsi="Khmer Mondulkiri" w:hint="cs"/>
+          <w:spacing w:val="2"/>
           <w:sz w:val="20"/>
           <w:lang w:val="en-US"/>
         </w:rPr>
@@ -3708,6 +3731,7 @@
       <w:r>
         <w:rPr>
           <w:rFonts w:ascii="Khmer Mondulkiri" w:hAnsi="Khmer Mondulkiri" w:hint="cs"/>
+          <w:spacing w:val="2"/>
           <w:sz w:val="20"/>
           <w:cs/>
           <w:lang w:val="en-US"/>
@@ -3717,6 +3741,7 @@
       <w:r>
         <w:rPr>
           <w:rFonts w:ascii="Khmer Mondulkiri" w:hAnsi="Khmer Mondulkiri" w:hint="cs"/>
+          <w:spacing w:val="2"/>
           <w:sz w:val="20"/>
           <w:cs/>
           <w:lang w:val="en-US"/>
@@ -3726,6 +3751,7 @@
       <w:r>
         <w:rPr>
           <w:rFonts w:ascii="Khmer Mondulkiri" w:hAnsi="Khmer Mondulkiri"/>
+          <w:spacing w:val="2"/>
           <w:sz w:val="20"/>
           <w:lang w:val="en-US"/>
         </w:rPr>
@@ -3734,6 +3760,7 @@
       <w:r>
         <w:rPr>
           <w:rFonts w:ascii="Khmer Mondulkiri" w:hAnsi="Khmer Mondulkiri" w:hint="cs"/>
+          <w:spacing w:val="2"/>
           <w:sz w:val="20"/>
           <w:lang w:val="en-US"/>
         </w:rPr>
@@ -3742,6 +3769,7 @@
       <w:r>
         <w:rPr>
           <w:rFonts w:ascii="Khmer Mondulkiri" w:hAnsi="Khmer Mondulkiri" w:hint="cs"/>
+          <w:spacing w:val="2"/>
           <w:sz w:val="20"/>
           <w:cs/>
           <w:lang w:val="en-US"/>
@@ -3751,6 +3779,7 @@
       <w:r>
         <w:rPr>
           <w:rFonts w:ascii="Khmer Mondulkiri" w:hAnsi="Khmer Mondulkiri" w:hint="cs"/>
+          <w:spacing w:val="2"/>
           <w:sz w:val="20"/>
           <w:cs/>
           <w:lang w:val="en-US"/>
@@ -3760,6 +3789,7 @@
       <w:r>
         <w:rPr>
           <w:rFonts w:ascii="Khmer Mondulkiri" w:hAnsi="Khmer Mondulkiri" w:hint="cs"/>
+          <w:spacing w:val="2"/>
           <w:sz w:val="20"/>
           <w:cs/>
           <w:lang w:val="en-US"/>
@@ -3769,6 +3799,7 @@
       <w:r>
         <w:rPr>
           <w:rFonts w:ascii="Khmer Mondulkiri" w:hAnsi="Khmer Mondulkiri" w:hint="cs"/>
+          <w:spacing w:val="2"/>
           <w:sz w:val="20"/>
           <w:cs/>
           <w:lang w:val="en-US"/>
@@ -3778,6 +3809,7 @@
       <w:r>
         <w:rPr>
           <w:rFonts w:ascii="Khmer Mondulkiri" w:hAnsi="Khmer Mondulkiri" w:hint="cs"/>
+          <w:spacing w:val="2"/>
           <w:sz w:val="20"/>
           <w:cs/>
           <w:lang w:val="en-US"/>
@@ -3787,6 +3819,7 @@
       <w:r>
         <w:rPr>
           <w:rFonts w:ascii="Khmer Mondulkiri" w:hAnsi="Khmer Mondulkiri"/>
+          <w:spacing w:val="2"/>
           <w:sz w:val="20"/>
           <w:lang w:val="en-US"/>
         </w:rPr>
@@ -3795,6 +3828,7 @@
       <w:r>
         <w:rPr>
           <w:rFonts w:ascii="Khmer Mondulkiri" w:hAnsi="Khmer Mondulkiri" w:hint="cs"/>
+          <w:spacing w:val="2"/>
           <w:sz w:val="20"/>
           <w:cs/>
           <w:lang w:val="en-US"/>
@@ -3804,6 +3838,7 @@
       <w:r>
         <w:rPr>
           <w:rFonts w:ascii="Khmer Mondulkiri" w:hAnsi="Khmer Mondulkiri" w:hint="cs"/>
+          <w:spacing w:val="2"/>
           <w:sz w:val="20"/>
           <w:cs/>
           <w:lang w:val="en-US"/>
@@ -3813,6 +3848,7 @@
       <w:r>
         <w:rPr>
           <w:rFonts w:ascii="Khmer Mondulkiri" w:hAnsi="Khmer Mondulkiri" w:hint="cs"/>
+          <w:spacing w:val="2"/>
           <w:sz w:val="20"/>
           <w:cs/>
           <w:lang w:val="en-US"/>
@@ -4517,6 +4553,7 @@
     </w:p>
     <w:p>
       <w:pPr>
+        <w:jc w:val="both"/>
         <w:rPr>
           <w:rFonts w:ascii="Khmer Mondulkiri" w:hAnsi="Khmer Mondulkiri"/>
           <w:sz w:val="20"/>
@@ -4744,6 +4781,7 @@
     </w:p>
     <w:p>
       <w:pPr>
+        <w:jc w:val="both"/>
         <w:rPr>
           <w:rFonts w:ascii="Khmer Mondulkiri" w:hAnsi="Khmer Mondulkiri"/>
           <w:sz w:val="20"/>
@@ -4851,6 +4889,7 @@
           <w:ilvl w:val="0"/>
           <w:numId w:val="9"/>
         </w:numPr>
+        <w:jc w:val="both"/>
         <w:rPr>
           <w:rFonts w:ascii="Khmer Mondulkiri" w:hAnsi="Khmer Mondulkiri"/>
           <w:sz w:val="20"/>
@@ -4907,6 +4946,7 @@
           <w:ilvl w:val="0"/>
           <w:numId w:val="9"/>
         </w:numPr>
+        <w:jc w:val="both"/>
         <w:rPr>
           <w:rFonts w:ascii="Khmer Mondulkiri" w:hAnsi="Khmer Mondulkiri"/>
           <w:sz w:val="20"/>
@@ -4964,6 +5004,7 @@
           <w:ilvl w:val="0"/>
           <w:numId w:val="9"/>
         </w:numPr>
+        <w:jc w:val="both"/>
         <w:rPr>
           <w:rFonts w:ascii="Khmer Mondulkiri" w:hAnsi="Khmer Mondulkiri"/>
           <w:sz w:val="20"/>
@@ -5187,6 +5228,7 @@
     </w:p>
     <w:p>
       <w:pPr>
+        <w:jc w:val="both"/>
         <w:rPr>
           <w:rFonts w:ascii="Khmer Mondulkiri" w:hAnsi="Khmer Mondulkiri"/>
           <w:sz w:val="20"/>
@@ -5222,6 +5264,7 @@
     </w:p>
     <w:p>
       <w:pPr>
+        <w:jc w:val="both"/>
         <w:rPr>
           <w:rFonts w:ascii="Khmer Mondulkiri" w:hAnsi="Khmer Mondulkiri"/>
           <w:sz w:val="20"/>
@@ -5760,7 +5803,7 @@
           <w:cs/>
           <w:lang w:val="en-US"/>
         </w:rPr>
-        <w:t>ទូរស័ព្ទ - ស្រទាប់លេខ​អារ៉ាប់</w:t>
+        <w:t>ទូរសព្ទ - ស្រទាប់លេខ​អារ៉ាប់</w:t>
       </w:r>
     </w:p>
     <w:p>
@@ -5783,6 +5826,7 @@
     </w:p>
     <w:p>
       <w:pPr>
+        <w:jc w:val="both"/>
         <w:rPr>
           <w:rFonts w:ascii="Khmer Mondulkiri" w:hAnsi="Khmer Mondulkiri"/>
           <w:sz w:val="20"/>
@@ -5823,7 +5867,7 @@
           <w:cs/>
           <w:lang w:val="en-US"/>
         </w:rPr>
-        <w:t>រយៈពេលពីរឬបីវិនាទីនៅលើគ្រាប់ចុចនោះ។ គ្រាប់ចុចដែល</w:t>
+        <w:t>រយៈពេលពីរឬបីវិនាទីនៅលើគ្រាប់ចុចនោះ។ គ្រាប់ចុចដែលលាក់</w:t>
       </w:r>
       <w:r>
         <w:rPr>
@@ -5833,11 +5877,12 @@
           <w:lang w:val="en-US"/>
         </w:rPr>
         <w:lastRenderedPageBreak/>
-        <w:t>លាក់ច្រើនទៀតនឹងបង្ហាញឡើងជាមួយនឹងគ្រាប់ចុចដែលបានជ្រើសរើសរួចដែលមានបន្លិចជាពណ៌ខៀវ។ ប្រសិនបើគ្រាប់ចុចជ្រើសរើសនោះមិនមែនជាគ្រាប់ចុចដែលអ្នកត្រូវការទេ អ្នកអាចរុញម្រាមដៃរបស់អ្នកទៅឆ្វេង ឬស្តាំ ដើម្បីជ្រើសរើសគ្រាប់ចុចដែលចង់បាន។</w:t>
+        <w:t>ច្រើនទៀតនឹងបង្ហាញឡើងជាមួយនឹងគ្រាប់ចុចដែលបានជ្រើសរើសរួចដែលមានបន្លិចជាពណ៌ខៀវ។ ប្រសិនបើគ្រាប់ចុចជ្រើសរើសនោះមិនមែនជាគ្រាប់ចុចដែលអ្នកត្រូវការទេ អ្នកអាចរុញម្រាមដៃរបស់អ្នកទៅឆ្វេង ឬស្តាំ ដើម្បីជ្រើសរើសគ្រាប់ចុចដែលចង់បាន។</w:t>
       </w:r>
     </w:p>
     <w:p>
       <w:pPr>
+        <w:jc w:val="both"/>
         <w:rPr>
           <w:rFonts w:ascii="Khmer Mondulkiri" w:hAnsi="Khmer Mondulkiri"/>
           <w:sz w:val="20"/>
@@ -10573,6 +10618,7 @@
                 <w:lang w:val="en-US"/>
               </w:rPr>
             </w:pPr>
+            <w:proofErr w:type="gramStart"/>
             <w:r>
               <w:rPr>
                 <w:rFonts w:ascii="Khmer Mondulkiri" w:hAnsi="Khmer Mondulkiri"/>
@@ -10581,6 +10627,7 @@
               </w:rPr>
               <w:t>Shift ,</w:t>
             </w:r>
+            <w:proofErr w:type="gramEnd"/>
           </w:p>
         </w:tc>
       </w:tr>
@@ -10824,6 +10871,7 @@
                 <w:lang w:val="en-US"/>
               </w:rPr>
             </w:pPr>
+            <w:proofErr w:type="gramStart"/>
             <w:r>
               <w:rPr>
                 <w:rFonts w:ascii="Khmer Mondulkiri" w:hAnsi="Khmer Mondulkiri"/>
@@ -10832,6 +10880,7 @@
               </w:rPr>
               <w:t>Shift ;</w:t>
             </w:r>
+            <w:proofErr w:type="gramEnd"/>
           </w:p>
         </w:tc>
       </w:tr>
@@ -11133,6 +11182,7 @@
               </w:rPr>
             </w:pPr>
             <w:proofErr w:type="spellStart"/>
+            <w:proofErr w:type="gramStart"/>
             <w:r>
               <w:rPr>
                 <w:rFonts w:ascii="Khmer Mondulkiri" w:hAnsi="Khmer Mondulkiri"/>
@@ -11150,6 +11200,7 @@
               </w:rPr>
               <w:t xml:space="preserve"> ’</w:t>
             </w:r>
+            <w:proofErr w:type="gramEnd"/>
           </w:p>
         </w:tc>
       </w:tr>
@@ -11783,6 +11834,7 @@
                 <w:lang w:val="en-US"/>
               </w:rPr>
             </w:pPr>
+            <w:proofErr w:type="gramStart"/>
             <w:r>
               <w:rPr>
                 <w:rFonts w:ascii="Khmer Mondulkiri" w:hAnsi="Khmer Mondulkiri"/>
@@ -11791,6 +11843,7 @@
               </w:rPr>
               <w:t>Shift ]</w:t>
             </w:r>
+            <w:proofErr w:type="gramEnd"/>
           </w:p>
         </w:tc>
         <w:tc>
@@ -12652,6 +12705,7 @@
               </w:rPr>
             </w:pPr>
             <w:proofErr w:type="spellStart"/>
+            <w:proofErr w:type="gramStart"/>
             <w:r>
               <w:rPr>
                 <w:rFonts w:ascii="Khmer Mondulkiri" w:hAnsi="Khmer Mondulkiri"/>
@@ -12669,6 +12723,7 @@
               </w:rPr>
               <w:t xml:space="preserve"> ]</w:t>
             </w:r>
+            <w:proofErr w:type="gramEnd"/>
           </w:p>
         </w:tc>
       </w:tr>
@@ -12920,6 +12975,7 @@
                 <w:lang w:val="en-US"/>
               </w:rPr>
             </w:pPr>
+            <w:proofErr w:type="gramStart"/>
             <w:r>
               <w:rPr>
                 <w:rFonts w:ascii="Khmer Mondulkiri" w:hAnsi="Khmer Mondulkiri"/>
@@ -12928,6 +12984,7 @@
               </w:rPr>
               <w:t>Shift ’</w:t>
             </w:r>
+            <w:proofErr w:type="gramEnd"/>
           </w:p>
         </w:tc>
         <w:tc>
@@ -14074,6 +14131,7 @@
                 <w:lang w:val="en-US"/>
               </w:rPr>
             </w:pPr>
+            <w:proofErr w:type="gramStart"/>
             <w:r>
               <w:rPr>
                 <w:rFonts w:ascii="Khmer Mondulkiri" w:hAnsi="Khmer Mondulkiri"/>
@@ -14082,6 +14140,7 @@
               </w:rPr>
               <w:t>Shift .</w:t>
             </w:r>
+            <w:proofErr w:type="gramEnd"/>
           </w:p>
         </w:tc>
         <w:tc>
@@ -14229,6 +14288,7 @@
               </w:rPr>
             </w:pPr>
             <w:proofErr w:type="spellStart"/>
+            <w:proofErr w:type="gramStart"/>
             <w:r>
               <w:rPr>
                 <w:rFonts w:ascii="Khmer Mondulkiri" w:hAnsi="Khmer Mondulkiri"/>
@@ -14246,6 +14306,7 @@
               </w:rPr>
               <w:t xml:space="preserve"> ;</w:t>
             </w:r>
+            <w:proofErr w:type="gramEnd"/>
           </w:p>
         </w:tc>
         <w:tc>
@@ -14703,6 +14764,7 @@
                 <w:lang w:val="en-US"/>
               </w:rPr>
             </w:pPr>
+            <w:proofErr w:type="gramStart"/>
             <w:r>
               <w:rPr>
                 <w:rFonts w:ascii="Khmer Mondulkiri" w:hAnsi="Khmer Mondulkiri"/>
@@ -14711,6 +14773,7 @@
               </w:rPr>
               <w:t>Shift ?</w:t>
             </w:r>
+            <w:proofErr w:type="gramEnd"/>
           </w:p>
         </w:tc>
         <w:tc>
@@ -14976,6 +15039,7 @@
               </w:rPr>
             </w:pPr>
             <w:proofErr w:type="spellStart"/>
+            <w:proofErr w:type="gramStart"/>
             <w:r>
               <w:rPr>
                 <w:rFonts w:ascii="Khmer Mondulkiri" w:hAnsi="Khmer Mondulkiri"/>
@@ -14991,6 +15055,7 @@
               </w:rPr>
               <w:t xml:space="preserve"> .</w:t>
             </w:r>
+            <w:proofErr w:type="gramEnd"/>
           </w:p>
         </w:tc>
         <w:tc>
@@ -15128,6 +15193,7 @@
               </w:rPr>
             </w:pPr>
             <w:proofErr w:type="spellStart"/>
+            <w:proofErr w:type="gramStart"/>
             <w:r>
               <w:rPr>
                 <w:rFonts w:ascii="Khmer Mondulkiri" w:hAnsi="Khmer Mondulkiri"/>
@@ -15143,6 +15209,7 @@
               </w:rPr>
               <w:t xml:space="preserve"> ,</w:t>
             </w:r>
+            <w:proofErr w:type="gramEnd"/>
           </w:p>
         </w:tc>
         <w:tc>
@@ -15173,6 +15240,7 @@
                 <w:sz w:val="20"/>
               </w:rPr>
             </w:pPr>
+            <w:proofErr w:type="gramStart"/>
             <w:r>
               <w:rPr>
                 <w:rFonts w:ascii="Khmer Mondulkiri" w:hAnsi="Khmer Mondulkiri"/>
@@ -15185,7 +15253,15 @@
                 <w:rFonts w:ascii="Courier New" w:hAnsi="Courier New" w:cs="Courier New"/>
                 <w:sz w:val="20"/>
               </w:rPr>
-              <w:t>[U+2018]</w:t>
+              <w:t>[</w:t>
+            </w:r>
+            <w:proofErr w:type="gramEnd"/>
+            <w:r>
+              <w:rPr>
+                <w:rFonts w:ascii="Courier New" w:hAnsi="Courier New" w:cs="Courier New"/>
+                <w:sz w:val="20"/>
+              </w:rPr>
+              <w:t>U+2018]</w:t>
             </w:r>
           </w:p>
         </w:tc>
@@ -19108,8 +19184,18 @@
                 <w:sz w:val="20"/>
                 <w:lang w:val="en-US"/>
               </w:rPr>
-              <w:t xml:space="preserve"> Shift ;</w:t>
-            </w:r>
+              <w:t xml:space="preserve"> </w:t>
+            </w:r>
+            <w:proofErr w:type="gramStart"/>
+            <w:r>
+              <w:rPr>
+                <w:rFonts w:ascii="Khmer Mondulkiri" w:hAnsi="Khmer Mondulkiri"/>
+                <w:sz w:val="20"/>
+                <w:lang w:val="en-US"/>
+              </w:rPr>
+              <w:t>Shift ;</w:t>
+            </w:r>
+            <w:proofErr w:type="gramEnd"/>
           </w:p>
         </w:tc>
       </w:tr>
@@ -19313,8 +19399,18 @@
                 <w:sz w:val="20"/>
                 <w:lang w:val="en-US"/>
               </w:rPr>
-              <w:t xml:space="preserve"> Shift ’</w:t>
-            </w:r>
+              <w:t xml:space="preserve"> </w:t>
+            </w:r>
+            <w:proofErr w:type="gramStart"/>
+            <w:r>
+              <w:rPr>
+                <w:rFonts w:ascii="Khmer Mondulkiri" w:hAnsi="Khmer Mondulkiri"/>
+                <w:sz w:val="20"/>
+                <w:lang w:val="en-US"/>
+              </w:rPr>
+              <w:t>Shift ’</w:t>
+            </w:r>
+            <w:proofErr w:type="gramEnd"/>
           </w:p>
         </w:tc>
       </w:tr>
@@ -20228,8 +20324,18 @@
                 <w:sz w:val="20"/>
                 <w:lang w:val="en-US"/>
               </w:rPr>
-              <w:t xml:space="preserve"> Shift ]</w:t>
-            </w:r>
+              <w:t xml:space="preserve"> </w:t>
+            </w:r>
+            <w:proofErr w:type="gramStart"/>
+            <w:r>
+              <w:rPr>
+                <w:rFonts w:ascii="Khmer Mondulkiri" w:hAnsi="Khmer Mondulkiri"/>
+                <w:sz w:val="20"/>
+                <w:lang w:val="en-US"/>
+              </w:rPr>
+              <w:t>Shift ]</w:t>
+            </w:r>
+            <w:proofErr w:type="gramEnd"/>
           </w:p>
         </w:tc>
         <w:tc>
@@ -20954,8 +21060,18 @@
                 <w:sz w:val="20"/>
                 <w:lang w:val="en-US"/>
               </w:rPr>
-              <w:t xml:space="preserve"> Shift ,</w:t>
-            </w:r>
+              <w:t xml:space="preserve"> </w:t>
+            </w:r>
+            <w:proofErr w:type="gramStart"/>
+            <w:r>
+              <w:rPr>
+                <w:rFonts w:ascii="Khmer Mondulkiri" w:hAnsi="Khmer Mondulkiri"/>
+                <w:sz w:val="20"/>
+                <w:lang w:val="en-US"/>
+              </w:rPr>
+              <w:t>Shift ,</w:t>
+            </w:r>
+            <w:proofErr w:type="gramEnd"/>
           </w:p>
         </w:tc>
       </w:tr>
@@ -21159,7 +21275,25 @@
                 <w:sz w:val="20"/>
                 <w:lang w:val="en-US"/>
               </w:rPr>
-              <w:t xml:space="preserve"> Shift . </w:t>
+              <w:t xml:space="preserve"> </w:t>
+            </w:r>
+            <w:proofErr w:type="gramStart"/>
+            <w:r>
+              <w:rPr>
+                <w:rFonts w:ascii="Khmer Mondulkiri" w:hAnsi="Khmer Mondulkiri"/>
+                <w:sz w:val="20"/>
+                <w:lang w:val="en-US"/>
+              </w:rPr>
+              <w:t>Shift .</w:t>
+            </w:r>
+            <w:proofErr w:type="gramEnd"/>
+            <w:r>
+              <w:rPr>
+                <w:rFonts w:ascii="Khmer Mondulkiri" w:hAnsi="Khmer Mondulkiri"/>
+                <w:sz w:val="20"/>
+                <w:lang w:val="en-US"/>
+              </w:rPr>
+              <w:t xml:space="preserve"> </w:t>
             </w:r>
           </w:p>
         </w:tc>
@@ -30402,7 +30536,7 @@
 </file>
 
 <file path=word/endnotes.xml><?xml version="1.0" encoding="utf-8"?>
-<w:endnotes xmlns:wpc="http://schemas.microsoft.com/office/word/2010/wordprocessingCanvas" xmlns:cx="http://schemas.microsoft.com/office/drawing/2014/chartex" xmlns:cx1="http://schemas.microsoft.com/office/drawing/2015/9/8/chartex" xmlns:cx2="http://schemas.microsoft.com/office/drawing/2015/10/21/chartex" xmlns:cx3="http://schemas.microsoft.com/office/drawing/2016/5/9/chartex" xmlns:cx4="http://schemas.microsoft.com/office/drawing/2016/5/10/chartex" xmlns:cx5="http://schemas.microsoft.com/office/drawing/2016/5/11/chartex" xmlns:cx6="http://schemas.microsoft.com/office/drawing/2016/5/12/chartex" xmlns:cx7="http://schemas.microsoft.com/office/drawing/2016/5/13/chartex" xmlns:cx8="http://schemas.microsoft.com/office/drawing/2016/5/14/chartex" xmlns:mc="http://schemas.openxmlformats.org/markup-compatibility/2006" xmlns:aink="http://schemas.microsoft.com/office/drawing/2016/ink" xmlns:am3d="http://schemas.microsoft.com/office/drawing/2017/model3d" xmlns:o="urn:schemas-microsoft-com:office:office" xmlns:oel="http://schemas.microsoft.com/office/2019/extlst" xmlns:r="http://schemas.openxmlformats.org/officeDocument/2006/relationships" xmlns:m="http://schemas.openxmlformats.org/officeDocument/2006/math" xmlns:v="urn:schemas-microsoft-com:vml" xmlns:wp14="http://schemas.microsoft.com/office/word/2010/wordprocessingDrawing" xmlns:wp="http://schemas.openxmlformats.org/drawingml/2006/wordprocessingDrawing" xmlns:w10="urn:schemas-microsoft-com:office:word" xmlns:w="http://schemas.openxmlformats.org/wordprocessingml/2006/main" xmlns:w14="http://schemas.microsoft.com/office/word/2010/wordml" xmlns:w15="http://schemas.microsoft.com/office/word/2012/wordml" xmlns:w16cex="http://schemas.microsoft.com/office/word/2018/wordml/cex" xmlns:w16cid="http://schemas.microsoft.com/office/word/2016/wordml/cid" xmlns:w16="http://schemas.microsoft.com/office/word/2018/wordml" xmlns:w16du="http://schemas.microsoft.com/office/word/2023/wordml/word16du" xmlns:w16sdtdh="http://schemas.microsoft.com/office/word/2020/wordml/sdtdatahash" xmlns:w16se="http://schemas.microsoft.com/office/word/2015/wordml/symex" xmlns:wpg="http://schemas.microsoft.com/office/word/2010/wordprocessingGroup" xmlns:wpi="http://schemas.microsoft.com/office/word/2010/wordprocessingInk" xmlns:wne="http://schemas.microsoft.com/office/word/2006/wordml" xmlns:wps="http://schemas.microsoft.com/office/word/2010/wordprocessingShape" mc:Ignorable="w14 w15 w16se w16cid w16 w16cex w16sdtdh w16du wp14">
+<w:endnotes xmlns:wpc="http://schemas.microsoft.com/office/word/2010/wordprocessingCanvas" xmlns:cx="http://schemas.microsoft.com/office/drawing/2014/chartex" xmlns:cx1="http://schemas.microsoft.com/office/drawing/2015/9/8/chartex" xmlns:cx2="http://schemas.microsoft.com/office/drawing/2015/10/21/chartex" xmlns:cx3="http://schemas.microsoft.com/office/drawing/2016/5/9/chartex" xmlns:cx4="http://schemas.microsoft.com/office/drawing/2016/5/10/chartex" xmlns:cx5="http://schemas.microsoft.com/office/drawing/2016/5/11/chartex" xmlns:cx6="http://schemas.microsoft.com/office/drawing/2016/5/12/chartex" xmlns:cx7="http://schemas.microsoft.com/office/drawing/2016/5/13/chartex" xmlns:cx8="http://schemas.microsoft.com/office/drawing/2016/5/14/chartex" xmlns:mc="http://schemas.openxmlformats.org/markup-compatibility/2006" xmlns:aink="http://schemas.microsoft.com/office/drawing/2016/ink" xmlns:am3d="http://schemas.microsoft.com/office/drawing/2017/model3d" xmlns:o="urn:schemas-microsoft-com:office:office" xmlns:oel="http://schemas.microsoft.com/office/2019/extlst" xmlns:r="http://schemas.openxmlformats.org/officeDocument/2006/relationships" xmlns:m="http://schemas.openxmlformats.org/officeDocument/2006/math" xmlns:v="urn:schemas-microsoft-com:vml" xmlns:wp14="http://schemas.microsoft.com/office/word/2010/wordprocessingDrawing" xmlns:wp="http://schemas.openxmlformats.org/drawingml/2006/wordprocessingDrawing" xmlns:w10="urn:schemas-microsoft-com:office:word" xmlns:w="http://schemas.openxmlformats.org/wordprocessingml/2006/main" xmlns:w14="http://schemas.microsoft.com/office/word/2010/wordml" xmlns:w15="http://schemas.microsoft.com/office/word/2012/wordml" xmlns:w16cex="http://schemas.microsoft.com/office/word/2018/wordml/cex" xmlns:w16cid="http://schemas.microsoft.com/office/word/2016/wordml/cid" xmlns:w16="http://schemas.microsoft.com/office/word/2018/wordml" xmlns:w16du="http://schemas.microsoft.com/office/word/2023/wordml/word16du" xmlns:w16sdtdh="http://schemas.microsoft.com/office/word/2020/wordml/sdtdatahash" xmlns:w16sdtfl="http://schemas.microsoft.com/office/word/2024/wordml/sdtformatlock" xmlns:w16se="http://schemas.microsoft.com/office/word/2015/wordml/symex" xmlns:wpg="http://schemas.microsoft.com/office/word/2010/wordprocessingGroup" xmlns:wpi="http://schemas.microsoft.com/office/word/2010/wordprocessingInk" xmlns:wne="http://schemas.microsoft.com/office/word/2006/wordml" xmlns:wps="http://schemas.microsoft.com/office/word/2010/wordprocessingShape" mc:Ignorable="w14 w15 w16se w16cid w16 w16cex w16sdtdh w16sdtfl w16du wp14">
   <w:endnote w:type="separator" w:id="-1">
     <w:p>
       <w:pPr>
@@ -30427,7 +30561,7 @@
 </file>
 
 <file path=word/footer1.xml><?xml version="1.0" encoding="utf-8"?>
-<w:ftr xmlns:wpc="http://schemas.microsoft.com/office/word/2010/wordprocessingCanvas" xmlns:cx="http://schemas.microsoft.com/office/drawing/2014/chartex" xmlns:cx1="http://schemas.microsoft.com/office/drawing/2015/9/8/chartex" xmlns:cx2="http://schemas.microsoft.com/office/drawing/2015/10/21/chartex" xmlns:cx3="http://schemas.microsoft.com/office/drawing/2016/5/9/chartex" xmlns:cx4="http://schemas.microsoft.com/office/drawing/2016/5/10/chartex" xmlns:cx5="http://schemas.microsoft.com/office/drawing/2016/5/11/chartex" xmlns:cx6="http://schemas.microsoft.com/office/drawing/2016/5/12/chartex" xmlns:cx7="http://schemas.microsoft.com/office/drawing/2016/5/13/chartex" xmlns:cx8="http://schemas.microsoft.com/office/drawing/2016/5/14/chartex" xmlns:mc="http://schemas.openxmlformats.org/markup-compatibility/2006" xmlns:aink="http://schemas.microsoft.com/office/drawing/2016/ink" xmlns:am3d="http://schemas.microsoft.com/office/drawing/2017/model3d" xmlns:o="urn:schemas-microsoft-com:office:office" xmlns:oel="http://schemas.microsoft.com/office/2019/extlst" xmlns:r="http://schemas.openxmlformats.org/officeDocument/2006/relationships" xmlns:m="http://schemas.openxmlformats.org/officeDocument/2006/math" xmlns:v="urn:schemas-microsoft-com:vml" xmlns:wp14="http://schemas.microsoft.com/office/word/2010/wordprocessingDrawing" xmlns:wp="http://schemas.openxmlformats.org/drawingml/2006/wordprocessingDrawing" xmlns:w10="urn:schemas-microsoft-com:office:word" xmlns:w="http://schemas.openxmlformats.org/wordprocessingml/2006/main" xmlns:w14="http://schemas.microsoft.com/office/word/2010/wordml" xmlns:w15="http://schemas.microsoft.com/office/word/2012/wordml" xmlns:w16cex="http://schemas.microsoft.com/office/word/2018/wordml/cex" xmlns:w16cid="http://schemas.microsoft.com/office/word/2016/wordml/cid" xmlns:w16="http://schemas.microsoft.com/office/word/2018/wordml" xmlns:w16du="http://schemas.microsoft.com/office/word/2023/wordml/word16du" xmlns:w16sdtdh="http://schemas.microsoft.com/office/word/2020/wordml/sdtdatahash" xmlns:w16se="http://schemas.microsoft.com/office/word/2015/wordml/symex" xmlns:wpg="http://schemas.microsoft.com/office/word/2010/wordprocessingGroup" xmlns:wpi="http://schemas.microsoft.com/office/word/2010/wordprocessingInk" xmlns:wne="http://schemas.microsoft.com/office/word/2006/wordml" xmlns:wps="http://schemas.microsoft.com/office/word/2010/wordprocessingShape" mc:Ignorable="w14 w15 w16se w16cid w16 w16cex w16sdtdh w16du wp14">
+<w:ftr xmlns:wpc="http://schemas.microsoft.com/office/word/2010/wordprocessingCanvas" xmlns:cx="http://schemas.microsoft.com/office/drawing/2014/chartex" xmlns:cx1="http://schemas.microsoft.com/office/drawing/2015/9/8/chartex" xmlns:cx2="http://schemas.microsoft.com/office/drawing/2015/10/21/chartex" xmlns:cx3="http://schemas.microsoft.com/office/drawing/2016/5/9/chartex" xmlns:cx4="http://schemas.microsoft.com/office/drawing/2016/5/10/chartex" xmlns:cx5="http://schemas.microsoft.com/office/drawing/2016/5/11/chartex" xmlns:cx6="http://schemas.microsoft.com/office/drawing/2016/5/12/chartex" xmlns:cx7="http://schemas.microsoft.com/office/drawing/2016/5/13/chartex" xmlns:cx8="http://schemas.microsoft.com/office/drawing/2016/5/14/chartex" xmlns:mc="http://schemas.openxmlformats.org/markup-compatibility/2006" xmlns:aink="http://schemas.microsoft.com/office/drawing/2016/ink" xmlns:am3d="http://schemas.microsoft.com/office/drawing/2017/model3d" xmlns:o="urn:schemas-microsoft-com:office:office" xmlns:oel="http://schemas.microsoft.com/office/2019/extlst" xmlns:r="http://schemas.openxmlformats.org/officeDocument/2006/relationships" xmlns:m="http://schemas.openxmlformats.org/officeDocument/2006/math" xmlns:v="urn:schemas-microsoft-com:vml" xmlns:wp14="http://schemas.microsoft.com/office/word/2010/wordprocessingDrawing" xmlns:wp="http://schemas.openxmlformats.org/drawingml/2006/wordprocessingDrawing" xmlns:w10="urn:schemas-microsoft-com:office:word" xmlns:w="http://schemas.openxmlformats.org/wordprocessingml/2006/main" xmlns:w14="http://schemas.microsoft.com/office/word/2010/wordml" xmlns:w15="http://schemas.microsoft.com/office/word/2012/wordml" xmlns:w16cex="http://schemas.microsoft.com/office/word/2018/wordml/cex" xmlns:w16cid="http://schemas.microsoft.com/office/word/2016/wordml/cid" xmlns:w16="http://schemas.microsoft.com/office/word/2018/wordml" xmlns:w16du="http://schemas.microsoft.com/office/word/2023/wordml/word16du" xmlns:w16sdtdh="http://schemas.microsoft.com/office/word/2020/wordml/sdtdatahash" xmlns:w16sdtfl="http://schemas.microsoft.com/office/word/2024/wordml/sdtformatlock" xmlns:w16se="http://schemas.microsoft.com/office/word/2015/wordml/symex" xmlns:wpg="http://schemas.microsoft.com/office/word/2010/wordprocessingGroup" xmlns:wpi="http://schemas.microsoft.com/office/word/2010/wordprocessingInk" xmlns:wne="http://schemas.microsoft.com/office/word/2006/wordml" xmlns:wps="http://schemas.microsoft.com/office/word/2010/wordprocessingShape" mc:Ignorable="w14 w15 w16se w16cid w16 w16cex w16sdtdh w16sdtfl w16du wp14">
   <w:p>
     <w:pPr>
       <w:tabs>
@@ -30692,7 +30826,7 @@
         <w:szCs w:val="16"/>
         <w:cs/>
       </w:rPr>
-      <w:t>០១</w:t>
+      <w:t>២៩</w:t>
     </w:r>
     <w:r>
       <w:rPr>
@@ -30714,7 +30848,7 @@
         <w:szCs w:val="16"/>
         <w:cs/>
       </w:rPr>
-      <w:t>សីហា</w:t>
+      <w:t>វិច្ឆិកា</w:t>
     </w:r>
     <w:r>
       <w:rPr>
@@ -30736,14 +30870,14 @@
         <w:szCs w:val="16"/>
         <w:cs/>
       </w:rPr>
-      <w:t>២</w:t>
+      <w:t>៤</w:t>
     </w:r>
   </w:p>
 </w:ftr>
 </file>
 
 <file path=word/footnotes.xml><?xml version="1.0" encoding="utf-8"?>
-<w:footnotes xmlns:wpc="http://schemas.microsoft.com/office/word/2010/wordprocessingCanvas" xmlns:cx="http://schemas.microsoft.com/office/drawing/2014/chartex" xmlns:cx1="http://schemas.microsoft.com/office/drawing/2015/9/8/chartex" xmlns:cx2="http://schemas.microsoft.com/office/drawing/2015/10/21/chartex" xmlns:cx3="http://schemas.microsoft.com/office/drawing/2016/5/9/chartex" xmlns:cx4="http://schemas.microsoft.com/office/drawing/2016/5/10/chartex" xmlns:cx5="http://schemas.microsoft.com/office/drawing/2016/5/11/chartex" xmlns:cx6="http://schemas.microsoft.com/office/drawing/2016/5/12/chartex" xmlns:cx7="http://schemas.microsoft.com/office/drawing/2016/5/13/chartex" xmlns:cx8="http://schemas.microsoft.com/office/drawing/2016/5/14/chartex" xmlns:mc="http://schemas.openxmlformats.org/markup-compatibility/2006" xmlns:aink="http://schemas.microsoft.com/office/drawing/2016/ink" xmlns:am3d="http://schemas.microsoft.com/office/drawing/2017/model3d" xmlns:o="urn:schemas-microsoft-com:office:office" xmlns:oel="http://schemas.microsoft.com/office/2019/extlst" xmlns:r="http://schemas.openxmlformats.org/officeDocument/2006/relationships" xmlns:m="http://schemas.openxmlformats.org/officeDocument/2006/math" xmlns:v="urn:schemas-microsoft-com:vml" xmlns:wp14="http://schemas.microsoft.com/office/word/2010/wordprocessingDrawing" xmlns:wp="http://schemas.openxmlformats.org/drawingml/2006/wordprocessingDrawing" xmlns:w10="urn:schemas-microsoft-com:office:word" xmlns:w="http://schemas.openxmlformats.org/wordprocessingml/2006/main" xmlns:w14="http://schemas.microsoft.com/office/word/2010/wordml" xmlns:w15="http://schemas.microsoft.com/office/word/2012/wordml" xmlns:w16cex="http://schemas.microsoft.com/office/word/2018/wordml/cex" xmlns:w16cid="http://schemas.microsoft.com/office/word/2016/wordml/cid" xmlns:w16="http://schemas.microsoft.com/office/word/2018/wordml" xmlns:w16du="http://schemas.microsoft.com/office/word/2023/wordml/word16du" xmlns:w16sdtdh="http://schemas.microsoft.com/office/word/2020/wordml/sdtdatahash" xmlns:w16se="http://schemas.microsoft.com/office/word/2015/wordml/symex" xmlns:wpg="http://schemas.microsoft.com/office/word/2010/wordprocessingGroup" xmlns:wpi="http://schemas.microsoft.com/office/word/2010/wordprocessingInk" xmlns:wne="http://schemas.microsoft.com/office/word/2006/wordml" xmlns:wps="http://schemas.microsoft.com/office/word/2010/wordprocessingShape" mc:Ignorable="w14 w15 w16se w16cid w16 w16cex w16sdtdh w16du wp14">
+<w:footnotes xmlns:wpc="http://schemas.microsoft.com/office/word/2010/wordprocessingCanvas" xmlns:cx="http://schemas.microsoft.com/office/drawing/2014/chartex" xmlns:cx1="http://schemas.microsoft.com/office/drawing/2015/9/8/chartex" xmlns:cx2="http://schemas.microsoft.com/office/drawing/2015/10/21/chartex" xmlns:cx3="http://schemas.microsoft.com/office/drawing/2016/5/9/chartex" xmlns:cx4="http://schemas.microsoft.com/office/drawing/2016/5/10/chartex" xmlns:cx5="http://schemas.microsoft.com/office/drawing/2016/5/11/chartex" xmlns:cx6="http://schemas.microsoft.com/office/drawing/2016/5/12/chartex" xmlns:cx7="http://schemas.microsoft.com/office/drawing/2016/5/13/chartex" xmlns:cx8="http://schemas.microsoft.com/office/drawing/2016/5/14/chartex" xmlns:mc="http://schemas.openxmlformats.org/markup-compatibility/2006" xmlns:aink="http://schemas.microsoft.com/office/drawing/2016/ink" xmlns:am3d="http://schemas.microsoft.com/office/drawing/2017/model3d" xmlns:o="urn:schemas-microsoft-com:office:office" xmlns:oel="http://schemas.microsoft.com/office/2019/extlst" xmlns:r="http://schemas.openxmlformats.org/officeDocument/2006/relationships" xmlns:m="http://schemas.openxmlformats.org/officeDocument/2006/math" xmlns:v="urn:schemas-microsoft-com:vml" xmlns:wp14="http://schemas.microsoft.com/office/word/2010/wordprocessingDrawing" xmlns:wp="http://schemas.openxmlformats.org/drawingml/2006/wordprocessingDrawing" xmlns:w10="urn:schemas-microsoft-com:office:word" xmlns:w="http://schemas.openxmlformats.org/wordprocessingml/2006/main" xmlns:w14="http://schemas.microsoft.com/office/word/2010/wordml" xmlns:w15="http://schemas.microsoft.com/office/word/2012/wordml" xmlns:w16cex="http://schemas.microsoft.com/office/word/2018/wordml/cex" xmlns:w16cid="http://schemas.microsoft.com/office/word/2016/wordml/cid" xmlns:w16="http://schemas.microsoft.com/office/word/2018/wordml" xmlns:w16du="http://schemas.microsoft.com/office/word/2023/wordml/word16du" xmlns:w16sdtdh="http://schemas.microsoft.com/office/word/2020/wordml/sdtdatahash" xmlns:w16sdtfl="http://schemas.microsoft.com/office/word/2024/wordml/sdtformatlock" xmlns:w16se="http://schemas.microsoft.com/office/word/2015/wordml/symex" xmlns:wpg="http://schemas.microsoft.com/office/word/2010/wordprocessingGroup" xmlns:wpi="http://schemas.microsoft.com/office/word/2010/wordprocessingInk" xmlns:wne="http://schemas.microsoft.com/office/word/2006/wordml" xmlns:wps="http://schemas.microsoft.com/office/word/2010/wordprocessingShape" mc:Ignorable="w14 w15 w16se w16cid w16 w16cex w16sdtdh w16sdtfl w16du wp14">
   <w:footnote w:type="separator" w:id="-1">
     <w:p>
       <w:pPr>
@@ -31215,7 +31349,7 @@
 </file>
 
 <file path=word/numbering.xml><?xml version="1.0" encoding="utf-8"?>
-<w:numbering xmlns:wpc="http://schemas.microsoft.com/office/word/2010/wordprocessingCanvas" xmlns:cx="http://schemas.microsoft.com/office/drawing/2014/chartex" xmlns:cx1="http://schemas.microsoft.com/office/drawing/2015/9/8/chartex" xmlns:cx2="http://schemas.microsoft.com/office/drawing/2015/10/21/chartex" xmlns:cx3="http://schemas.microsoft.com/office/drawing/2016/5/9/chartex" xmlns:cx4="http://schemas.microsoft.com/office/drawing/2016/5/10/chartex" xmlns:cx5="http://schemas.microsoft.com/office/drawing/2016/5/11/chartex" xmlns:cx6="http://schemas.microsoft.com/office/drawing/2016/5/12/chartex" xmlns:cx7="http://schemas.microsoft.com/office/drawing/2016/5/13/chartex" xmlns:cx8="http://schemas.microsoft.com/office/drawing/2016/5/14/chartex" xmlns:mc="http://schemas.openxmlformats.org/markup-compatibility/2006" xmlns:aink="http://schemas.microsoft.com/office/drawing/2016/ink" xmlns:am3d="http://schemas.microsoft.com/office/drawing/2017/model3d" xmlns:o="urn:schemas-microsoft-com:office:office" xmlns:oel="http://schemas.microsoft.com/office/2019/extlst" xmlns:r="http://schemas.openxmlformats.org/officeDocument/2006/relationships" xmlns:m="http://schemas.openxmlformats.org/officeDocument/2006/math" xmlns:v="urn:schemas-microsoft-com:vml" xmlns:wp14="http://schemas.microsoft.com/office/word/2010/wordprocessingDrawing" xmlns:wp="http://schemas.openxmlformats.org/drawingml/2006/wordprocessingDrawing" xmlns:w10="urn:schemas-microsoft-com:office:word" xmlns:w="http://schemas.openxmlformats.org/wordprocessingml/2006/main" xmlns:w14="http://schemas.microsoft.com/office/word/2010/wordml" xmlns:w15="http://schemas.microsoft.com/office/word/2012/wordml" xmlns:w16cex="http://schemas.microsoft.com/office/word/2018/wordml/cex" xmlns:w16cid="http://schemas.microsoft.com/office/word/2016/wordml/cid" xmlns:w16="http://schemas.microsoft.com/office/word/2018/wordml" xmlns:w16du="http://schemas.microsoft.com/office/word/2023/wordml/word16du" xmlns:w16sdtdh="http://schemas.microsoft.com/office/word/2020/wordml/sdtdatahash" xmlns:w16se="http://schemas.microsoft.com/office/word/2015/wordml/symex" xmlns:wpg="http://schemas.microsoft.com/office/word/2010/wordprocessingGroup" xmlns:wpi="http://schemas.microsoft.com/office/word/2010/wordprocessingInk" xmlns:wne="http://schemas.microsoft.com/office/word/2006/wordml" xmlns:wps="http://schemas.microsoft.com/office/word/2010/wordprocessingShape" mc:Ignorable="w14 w15 w16se w16cid w16 w16cex w16sdtdh w16du wp14">
+<w:numbering xmlns:wpc="http://schemas.microsoft.com/office/word/2010/wordprocessingCanvas" xmlns:cx="http://schemas.microsoft.com/office/drawing/2014/chartex" xmlns:cx1="http://schemas.microsoft.com/office/drawing/2015/9/8/chartex" xmlns:cx2="http://schemas.microsoft.com/office/drawing/2015/10/21/chartex" xmlns:cx3="http://schemas.microsoft.com/office/drawing/2016/5/9/chartex" xmlns:cx4="http://schemas.microsoft.com/office/drawing/2016/5/10/chartex" xmlns:cx5="http://schemas.microsoft.com/office/drawing/2016/5/11/chartex" xmlns:cx6="http://schemas.microsoft.com/office/drawing/2016/5/12/chartex" xmlns:cx7="http://schemas.microsoft.com/office/drawing/2016/5/13/chartex" xmlns:cx8="http://schemas.microsoft.com/office/drawing/2016/5/14/chartex" xmlns:mc="http://schemas.openxmlformats.org/markup-compatibility/2006" xmlns:aink="http://schemas.microsoft.com/office/drawing/2016/ink" xmlns:am3d="http://schemas.microsoft.com/office/drawing/2017/model3d" xmlns:o="urn:schemas-microsoft-com:office:office" xmlns:oel="http://schemas.microsoft.com/office/2019/extlst" xmlns:r="http://schemas.openxmlformats.org/officeDocument/2006/relationships" xmlns:m="http://schemas.openxmlformats.org/officeDocument/2006/math" xmlns:v="urn:schemas-microsoft-com:vml" xmlns:wp14="http://schemas.microsoft.com/office/word/2010/wordprocessingDrawing" xmlns:wp="http://schemas.openxmlformats.org/drawingml/2006/wordprocessingDrawing" xmlns:w10="urn:schemas-microsoft-com:office:word" xmlns:w="http://schemas.openxmlformats.org/wordprocessingml/2006/main" xmlns:w14="http://schemas.microsoft.com/office/word/2010/wordml" xmlns:w15="http://schemas.microsoft.com/office/word/2012/wordml" xmlns:w16cex="http://schemas.microsoft.com/office/word/2018/wordml/cex" xmlns:w16cid="http://schemas.microsoft.com/office/word/2016/wordml/cid" xmlns:w16="http://schemas.microsoft.com/office/word/2018/wordml" xmlns:w16du="http://schemas.microsoft.com/office/word/2023/wordml/word16du" xmlns:w16sdtdh="http://schemas.microsoft.com/office/word/2020/wordml/sdtdatahash" xmlns:w16sdtfl="http://schemas.microsoft.com/office/word/2024/wordml/sdtformatlock" xmlns:w16se="http://schemas.microsoft.com/office/word/2015/wordml/symex" xmlns:wpg="http://schemas.microsoft.com/office/word/2010/wordprocessingGroup" xmlns:wpi="http://schemas.microsoft.com/office/word/2010/wordprocessingInk" xmlns:wne="http://schemas.microsoft.com/office/word/2006/wordml" xmlns:wps="http://schemas.microsoft.com/office/word/2010/wordprocessingShape" mc:Ignorable="w14 w15 w16se w16cid w16 w16cex w16sdtdh w16sdtfl w16du wp14">
   <w:abstractNum w:abstractNumId="0" w15:restartNumberingAfterBreak="0">
     <w:nsid w:val="060A7005"/>
     <w:multiLevelType w:val="hybridMultilevel"/>
@@ -32273,7 +32407,7 @@
 </file>
 
 <file path=word/styles.xml><?xml version="1.0" encoding="utf-8"?>
-<w:styles xmlns:mc="http://schemas.openxmlformats.org/markup-compatibility/2006" xmlns:r="http://schemas.openxmlformats.org/officeDocument/2006/relationships" xmlns:w="http://schemas.openxmlformats.org/wordprocessingml/2006/main" xmlns:w14="http://schemas.microsoft.com/office/word/2010/wordml" xmlns:w15="http://schemas.microsoft.com/office/word/2012/wordml" xmlns:w16cex="http://schemas.microsoft.com/office/word/2018/wordml/cex" xmlns:w16cid="http://schemas.microsoft.com/office/word/2016/wordml/cid" xmlns:w16="http://schemas.microsoft.com/office/word/2018/wordml" xmlns:w16du="http://schemas.microsoft.com/office/word/2023/wordml/word16du" xmlns:w16sdtdh="http://schemas.microsoft.com/office/word/2020/wordml/sdtdatahash" xmlns:w16se="http://schemas.microsoft.com/office/word/2015/wordml/symex" mc:Ignorable="w14 w15 w16se w16cid w16 w16cex w16sdtdh w16du">
+<w:styles xmlns:mc="http://schemas.openxmlformats.org/markup-compatibility/2006" xmlns:r="http://schemas.openxmlformats.org/officeDocument/2006/relationships" xmlns:w="http://schemas.openxmlformats.org/wordprocessingml/2006/main" xmlns:w14="http://schemas.microsoft.com/office/word/2010/wordml" xmlns:w15="http://schemas.microsoft.com/office/word/2012/wordml" xmlns:w16cex="http://schemas.microsoft.com/office/word/2018/wordml/cex" xmlns:w16cid="http://schemas.microsoft.com/office/word/2016/wordml/cid" xmlns:w16="http://schemas.microsoft.com/office/word/2018/wordml" xmlns:w16du="http://schemas.microsoft.com/office/word/2023/wordml/word16du" xmlns:w16sdtdh="http://schemas.microsoft.com/office/word/2020/wordml/sdtdatahash" xmlns:w16sdtfl="http://schemas.microsoft.com/office/word/2024/wordml/sdtformatlock" xmlns:w16se="http://schemas.microsoft.com/office/word/2015/wordml/symex" mc:Ignorable="w14 w15 w16se w16cid w16 w16cex w16sdtdh w16sdtfl w16du">
   <w:docDefaults>
     <w:rPrDefault>
       <w:rPr>

</xml_diff>